<commit_message>
Optional relevance-gated publications, language subsets, droppable company notes
- publications: new optional {id, citation} section (verbatim subset of
  master.yaml), rendered after Education in PDF + DOCX, counted by coverage.
  The tailor includes it only for research / R&D / medical-affairs roles.
- languages: validator now checks entries against master (subset allowed,
  no added languages or upgraded levels); prompt drops basic-level languages
  a role doesn't value, keeps French when the JD asks for it.
- multinational_note: may be omitted under space pressure (LG Chem's kept by
  default); added as a cheap overflow trim.
- docs/sample re-rendered with the reverse-chronological renderer.

Co-Authored-By: Claude Opus 5.5 <noreply@anthropic.com>
</commit_message>
<xml_diff>
--- a/docs/sample/resume.docx
+++ b/docs/sample/resume.docx
@@ -86,6 +86,72 @@
           <w:sz w:val="22"/>
         </w:rPr>
         <w:t>Experience</w:t>
+      </w:r>
+    </w:p>
+    <w:p>
+      <w:pPr>
+        <w:tabs>
+          <w:tab w:pos="10800" w:val="right"/>
+        </w:tabs>
+      </w:pPr>
+      <w:r>
+        <w:rPr>
+          <w:rFonts w:ascii="Calibri" w:hAnsi="Calibri"/>
+          <w:b/>
+          <w:i w:val="0"/>
+          <w:sz w:val="21"/>
+        </w:rPr>
+        <w:t>Program &amp; Outreach Coordinator</w:t>
+      </w:r>
+      <w:r>
+        <w:rPr>
+          <w:rFonts w:ascii="Calibri" w:hAnsi="Calibri"/>
+          <w:b w:val="0"/>
+          <w:i w:val="0"/>
+          <w:sz w:val="21"/>
+        </w:rPr>
+        <w:tab/>
+        <w:t>Feb 2026 - Present</w:t>
+      </w:r>
+    </w:p>
+    <w:p>
+      <w:pPr>
+        <w:tabs>
+          <w:tab w:pos="10800" w:val="right"/>
+        </w:tabs>
+      </w:pPr>
+      <w:r>
+        <w:rPr>
+          <w:rFonts w:ascii="Calibri" w:hAnsi="Calibri"/>
+          <w:b w:val="0"/>
+          <w:i w:val="0"/>
+          <w:sz w:val="21"/>
+        </w:rPr>
+        <w:t>Harborlight Community Foundation</w:t>
+      </w:r>
+      <w:r>
+        <w:rPr>
+          <w:rFonts w:ascii="Calibri" w:hAnsi="Calibri"/>
+          <w:b w:val="0"/>
+          <w:i w:val="0"/>
+          <w:sz w:val="21"/>
+        </w:rPr>
+        <w:tab/>
+        <w:t>Toronto, ON</w:t>
+      </w:r>
+    </w:p>
+    <w:p>
+      <w:pPr>
+        <w:pStyle w:val="ListBullet"/>
+      </w:pPr>
+      <w:r>
+        <w:rPr>
+          <w:rFonts w:ascii="Calibri" w:hAnsi="Calibri"/>
+          <w:b w:val="0"/>
+          <w:i w:val="0"/>
+          <w:sz w:val="21"/>
+        </w:rPr>
+        <w:t>Built a tiered outreach system spanning 9 partner categories and 4 engagement stages — standardized templates, a prospect database, and a tracked follow-up cadence.</w:t>
       </w:r>
     </w:p>
     <w:p>
@@ -255,72 +321,6 @@
           <w:sz w:val="21"/>
         </w:rPr>
         <w:t>Coordinated delivery of 8 partner integrations end to end, aligning product, legal, and finance to launch each on schedule.</w:t>
-      </w:r>
-    </w:p>
-    <w:p>
-      <w:pPr>
-        <w:tabs>
-          <w:tab w:pos="10800" w:val="right"/>
-        </w:tabs>
-      </w:pPr>
-      <w:r>
-        <w:rPr>
-          <w:rFonts w:ascii="Calibri" w:hAnsi="Calibri"/>
-          <w:b/>
-          <w:i w:val="0"/>
-          <w:sz w:val="21"/>
-        </w:rPr>
-        <w:t>Program &amp; Outreach Coordinator</w:t>
-      </w:r>
-      <w:r>
-        <w:rPr>
-          <w:rFonts w:ascii="Calibri" w:hAnsi="Calibri"/>
-          <w:b w:val="0"/>
-          <w:i w:val="0"/>
-          <w:sz w:val="21"/>
-        </w:rPr>
-        <w:tab/>
-        <w:t>Feb 2026 - Present</w:t>
-      </w:r>
-    </w:p>
-    <w:p>
-      <w:pPr>
-        <w:tabs>
-          <w:tab w:pos="10800" w:val="right"/>
-        </w:tabs>
-      </w:pPr>
-      <w:r>
-        <w:rPr>
-          <w:rFonts w:ascii="Calibri" w:hAnsi="Calibri"/>
-          <w:b w:val="0"/>
-          <w:i w:val="0"/>
-          <w:sz w:val="21"/>
-        </w:rPr>
-        <w:t>Harborlight Community Foundation</w:t>
-      </w:r>
-      <w:r>
-        <w:rPr>
-          <w:rFonts w:ascii="Calibri" w:hAnsi="Calibri"/>
-          <w:b w:val="0"/>
-          <w:i w:val="0"/>
-          <w:sz w:val="21"/>
-        </w:rPr>
-        <w:tab/>
-        <w:t>Toronto, ON</w:t>
-      </w:r>
-    </w:p>
-    <w:p>
-      <w:pPr>
-        <w:pStyle w:val="ListBullet"/>
-      </w:pPr>
-      <w:r>
-        <w:rPr>
-          <w:rFonts w:ascii="Calibri" w:hAnsi="Calibri"/>
-          <w:b w:val="0"/>
-          <w:i w:val="0"/>
-          <w:sz w:val="21"/>
-        </w:rPr>
-        <w:t>Built a tiered outreach system spanning 9 partner categories and 4 engagement stages — standardized templates, a prospect database, and a tracked follow-up cadence.</w:t>
       </w:r>
     </w:p>
     <w:p>

</xml_diff>